<commit_message>
Screenshots toevoegen aan word doc
</commit_message>
<xml_diff>
--- a/Gebruiksaanwijzing Yahtzee.docx
+++ b/Gebruiksaanwijzing Yahtzee.docx
@@ -1116,11 +1116,6 @@
       </w:r>
     </w:p>
     <w:p>
-      <w:r>
-        <w:t>[Screenshot (1)]</w:t>
-      </w:r>
-    </w:p>
-    <w:p>
       <w:pPr>
         <w:pStyle w:val="Kop2"/>
         <w:rPr>
@@ -1131,6 +1126,49 @@
       <w:bookmarkStart w:id="3" w:name="_Toc242436764"/>
       <w:r>
         <w:rPr>
+          <w:rFonts w:asciiTheme="minorHAnsi" w:eastAsiaTheme="minorHAnsi" w:hAnsiTheme="minorHAnsi" w:cstheme="minorBidi"/>
+          <w:color w:val="auto"/>
+          <w:sz w:val="24"/>
+          <w:szCs w:val="24"/>
+        </w:rPr>
+        <w:drawing>
+          <wp:inline distT="0" distB="0" distL="0" distR="0" wp14:anchorId="6A8B6C13" wp14:editId="37FE3F45">
+            <wp:extent cx="5760720" cy="802640"/>
+            <wp:effectExtent l="0" t="0" r="0" b="0"/>
+            <wp:docPr id="1538646956" name="Afbeelding 1"/>
+            <wp:cNvGraphicFramePr>
+              <a:graphicFrameLocks xmlns:a="http://schemas.openxmlformats.org/drawingml/2006/main" noChangeAspect="1"/>
+            </wp:cNvGraphicFramePr>
+            <a:graphic xmlns:a="http://schemas.openxmlformats.org/drawingml/2006/main">
+              <a:graphicData uri="http://schemas.openxmlformats.org/drawingml/2006/picture">
+                <pic:pic xmlns:pic="http://schemas.openxmlformats.org/drawingml/2006/picture">
+                  <pic:nvPicPr>
+                    <pic:cNvPr id="1538646956" name=""/>
+                    <pic:cNvPicPr/>
+                  </pic:nvPicPr>
+                  <pic:blipFill>
+                    <a:blip r:embed="rId6"/>
+                    <a:stretch>
+                      <a:fillRect/>
+                    </a:stretch>
+                  </pic:blipFill>
+                  <pic:spPr>
+                    <a:xfrm>
+                      <a:off x="0" y="0"/>
+                      <a:ext cx="5760720" cy="802640"/>
+                    </a:xfrm>
+                    <a:prstGeom prst="rect">
+                      <a:avLst/>
+                    </a:prstGeom>
+                  </pic:spPr>
+                </pic:pic>
+              </a:graphicData>
+            </a:graphic>
+          </wp:inline>
+        </w:drawing>
+      </w:r>
+      <w:r>
+        <w:rPr>
           <w:b/>
           <w:bCs/>
         </w:rPr>
@@ -1164,7 +1202,7 @@
     </w:p>
     <w:p>
       <w:r>
-        <w:t>[Screenshot (2)]</w:t>
+        <w:t>Zie bovenstaande screenshot voor speler aantal mogelijkheden.</w:t>
       </w:r>
     </w:p>
     <w:p>
@@ -1201,7 +1239,19 @@
     </w:p>
     <w:p>
       <w:r>
-        <w:t>Vervolgens vraagt de applicatie hoeveel wedstrijden de gebruiker wil spelen. Er kan gekozen worden uit één of vijf wedstrijden. Voer de gewenste optie in en druk op Enter.</w:t>
+        <w:t xml:space="preserve">Vervolgens vraagt de applicatie hoeveel wedstrijden de gebruiker wil spelen. Er kan gekozen worden uit één of vijf wedstrijden. Voer </w:t>
+      </w:r>
+      <w:r>
+        <w:t xml:space="preserve">het aantal </w:t>
+      </w:r>
+      <w:r>
+        <w:t>in</w:t>
+      </w:r>
+      <w:r>
+        <w:t xml:space="preserve"> dat je wil spelen</w:t>
+      </w:r>
+      <w:r>
+        <w:t xml:space="preserve"> en druk op Enter.</w:t>
       </w:r>
     </w:p>
     <w:p>
@@ -1210,11 +1260,6 @@
       </w:r>
     </w:p>
     <w:p>
-      <w:r>
-        <w:t>[Screenshot (3)]</w:t>
-      </w:r>
-    </w:p>
-    <w:p>
       <w:pPr>
         <w:pStyle w:val="Kop2"/>
         <w:rPr>
@@ -1225,9 +1270,67 @@
       <w:bookmarkStart w:id="5" w:name="_Toc242436766"/>
       <w:r>
         <w:rPr>
-          <w:b/>
-          <w:bCs/>
-        </w:rPr>
+          <w:rFonts w:asciiTheme="minorHAnsi" w:eastAsiaTheme="minorHAnsi" w:hAnsiTheme="minorHAnsi" w:cstheme="minorBidi"/>
+          <w:color w:val="auto"/>
+          <w:sz w:val="24"/>
+          <w:szCs w:val="24"/>
+        </w:rPr>
+        <w:drawing>
+          <wp:inline distT="0" distB="0" distL="0" distR="0" wp14:anchorId="59B9F80A" wp14:editId="43F08550">
+            <wp:extent cx="5760720" cy="1018540"/>
+            <wp:effectExtent l="0" t="0" r="0" b="0"/>
+            <wp:docPr id="92714156" name="Afbeelding 1"/>
+            <wp:cNvGraphicFramePr>
+              <a:graphicFrameLocks xmlns:a="http://schemas.openxmlformats.org/drawingml/2006/main" noChangeAspect="1"/>
+            </wp:cNvGraphicFramePr>
+            <a:graphic xmlns:a="http://schemas.openxmlformats.org/drawingml/2006/main">
+              <a:graphicData uri="http://schemas.openxmlformats.org/drawingml/2006/picture">
+                <pic:pic xmlns:pic="http://schemas.openxmlformats.org/drawingml/2006/picture">
+                  <pic:nvPicPr>
+                    <pic:cNvPr id="92714156" name=""/>
+                    <pic:cNvPicPr/>
+                  </pic:nvPicPr>
+                  <pic:blipFill>
+                    <a:blip r:embed="rId7"/>
+                    <a:stretch>
+                      <a:fillRect/>
+                    </a:stretch>
+                  </pic:blipFill>
+                  <pic:spPr>
+                    <a:xfrm>
+                      <a:off x="0" y="0"/>
+                      <a:ext cx="5760720" cy="1018540"/>
+                    </a:xfrm>
+                    <a:prstGeom prst="rect">
+                      <a:avLst/>
+                    </a:prstGeom>
+                  </pic:spPr>
+                </pic:pic>
+              </a:graphicData>
+            </a:graphic>
+          </wp:inline>
+        </w:drawing>
+      </w:r>
+    </w:p>
+    <w:p/>
+    <w:p/>
+    <w:p/>
+    <w:p/>
+    <w:p/>
+    <w:p>
+      <w:pPr>
+        <w:pStyle w:val="Kop2"/>
+        <w:rPr>
+          <w:b/>
+          <w:bCs/>
+        </w:rPr>
+      </w:pPr>
+      <w:r>
+        <w:rPr>
+          <w:b/>
+          <w:bCs/>
+        </w:rPr>
+        <w:lastRenderedPageBreak/>
         <w:t>4</w:t>
       </w:r>
       <w:r>
@@ -1257,11 +1360,6 @@
       </w:r>
     </w:p>
     <w:p>
-      <w:r>
-        <w:t>[Screenshot (4)]</w:t>
-      </w:r>
-    </w:p>
-    <w:p>
       <w:pPr>
         <w:pStyle w:val="Kop2"/>
         <w:rPr>
@@ -1272,9 +1370,76 @@
       <w:bookmarkStart w:id="6" w:name="_Toc242436767"/>
       <w:r>
         <w:rPr>
-          <w:b/>
-          <w:bCs/>
-        </w:rPr>
+          <w:rFonts w:asciiTheme="minorHAnsi" w:eastAsiaTheme="minorHAnsi" w:hAnsiTheme="minorHAnsi" w:cstheme="minorBidi"/>
+          <w:color w:val="auto"/>
+          <w:sz w:val="24"/>
+          <w:szCs w:val="24"/>
+        </w:rPr>
+        <w:drawing>
+          <wp:inline distT="0" distB="0" distL="0" distR="0" wp14:anchorId="4BE763E2" wp14:editId="736F28E6">
+            <wp:extent cx="5760720" cy="2230120"/>
+            <wp:effectExtent l="0" t="0" r="0" b="0"/>
+            <wp:docPr id="1521765629" name="Afbeelding 1"/>
+            <wp:cNvGraphicFramePr>
+              <a:graphicFrameLocks xmlns:a="http://schemas.openxmlformats.org/drawingml/2006/main" noChangeAspect="1"/>
+            </wp:cNvGraphicFramePr>
+            <a:graphic xmlns:a="http://schemas.openxmlformats.org/drawingml/2006/main">
+              <a:graphicData uri="http://schemas.openxmlformats.org/drawingml/2006/picture">
+                <pic:pic xmlns:pic="http://schemas.openxmlformats.org/drawingml/2006/picture">
+                  <pic:nvPicPr>
+                    <pic:cNvPr id="1521765629" name=""/>
+                    <pic:cNvPicPr/>
+                  </pic:nvPicPr>
+                  <pic:blipFill>
+                    <a:blip r:embed="rId8"/>
+                    <a:stretch>
+                      <a:fillRect/>
+                    </a:stretch>
+                  </pic:blipFill>
+                  <pic:spPr>
+                    <a:xfrm>
+                      <a:off x="0" y="0"/>
+                      <a:ext cx="5760720" cy="2230120"/>
+                    </a:xfrm>
+                    <a:prstGeom prst="rect">
+                      <a:avLst/>
+                    </a:prstGeom>
+                  </pic:spPr>
+                </pic:pic>
+              </a:graphicData>
+            </a:graphic>
+          </wp:inline>
+        </w:drawing>
+      </w:r>
+    </w:p>
+    <w:p/>
+    <w:p/>
+    <w:p/>
+    <w:p/>
+    <w:p/>
+    <w:p/>
+    <w:p/>
+    <w:p/>
+    <w:p/>
+    <w:p/>
+    <w:p/>
+    <w:p/>
+    <w:p/>
+    <w:p/>
+    <w:p>
+      <w:pPr>
+        <w:pStyle w:val="Kop2"/>
+        <w:rPr>
+          <w:b/>
+          <w:bCs/>
+        </w:rPr>
+      </w:pPr>
+      <w:r>
+        <w:rPr>
+          <w:b/>
+          <w:bCs/>
+        </w:rPr>
+        <w:lastRenderedPageBreak/>
         <w:t>5</w:t>
       </w:r>
       <w:r>
@@ -1309,11 +1474,226 @@
       </w:r>
     </w:p>
     <w:p>
-      <w:r>
+      <w:pPr>
+        <w:pStyle w:val="Kop2"/>
+        <w:rPr>
+          <w:b/>
+          <w:bCs/>
+        </w:rPr>
+      </w:pPr>
+      <w:bookmarkStart w:id="7" w:name="_Toc242436768"/>
+      <w:r>
+        <w:rPr>
+          <w:rFonts w:asciiTheme="minorHAnsi" w:eastAsiaTheme="minorHAnsi" w:hAnsiTheme="minorHAnsi" w:cstheme="minorBidi"/>
+          <w:color w:val="auto"/>
+          <w:sz w:val="24"/>
+          <w:szCs w:val="24"/>
+        </w:rPr>
+        <w:drawing>
+          <wp:inline distT="0" distB="0" distL="0" distR="0" wp14:anchorId="4137B44F" wp14:editId="4BDEB685">
+            <wp:extent cx="5760720" cy="3383280"/>
+            <wp:effectExtent l="0" t="0" r="0" b="7620"/>
+            <wp:docPr id="1066209249" name="Afbeelding 1"/>
+            <wp:cNvGraphicFramePr>
+              <a:graphicFrameLocks xmlns:a="http://schemas.openxmlformats.org/drawingml/2006/main" noChangeAspect="1"/>
+            </wp:cNvGraphicFramePr>
+            <a:graphic xmlns:a="http://schemas.openxmlformats.org/drawingml/2006/main">
+              <a:graphicData uri="http://schemas.openxmlformats.org/drawingml/2006/picture">
+                <pic:pic xmlns:pic="http://schemas.openxmlformats.org/drawingml/2006/picture">
+                  <pic:nvPicPr>
+                    <pic:cNvPr id="1066209249" name=""/>
+                    <pic:cNvPicPr/>
+                  </pic:nvPicPr>
+                  <pic:blipFill>
+                    <a:blip r:embed="rId9"/>
+                    <a:stretch>
+                      <a:fillRect/>
+                    </a:stretch>
+                  </pic:blipFill>
+                  <pic:spPr>
+                    <a:xfrm>
+                      <a:off x="0" y="0"/>
+                      <a:ext cx="5760720" cy="3383280"/>
+                    </a:xfrm>
+                    <a:prstGeom prst="rect">
+                      <a:avLst/>
+                    </a:prstGeom>
+                  </pic:spPr>
+                </pic:pic>
+              </a:graphicData>
+            </a:graphic>
+          </wp:inline>
+        </w:drawing>
+      </w:r>
+    </w:p>
+    <w:p>
+      <w:r>
+        <w:t xml:space="preserve">Screenshot van worp twee waarin dobbelsteen 2 en 5 wordt behouden en de rest wordt </w:t>
+      </w:r>
+      <w:proofErr w:type="spellStart"/>
+      <w:r>
+        <w:t>hergooid</w:t>
+      </w:r>
+      <w:proofErr w:type="spellEnd"/>
+      <w:r>
+        <w:t>.</w:t>
+      </w:r>
+    </w:p>
+    <w:p/>
+    <w:p/>
+    <w:p/>
+    <w:p/>
+    <w:p/>
+    <w:p/>
+    <w:p/>
+    <w:p/>
+    <w:p>
+      <w:pPr>
+        <w:pStyle w:val="Kop2"/>
+        <w:rPr>
+          <w:b/>
+          <w:bCs/>
+        </w:rPr>
+      </w:pPr>
+      <w:r>
+        <w:rPr>
+          <w:b/>
+          <w:bCs/>
+        </w:rPr>
         <w:lastRenderedPageBreak/>
-        <w:t>[Screenshot (5)]</w:t>
-      </w:r>
-    </w:p>
+        <w:t>6</w:t>
+      </w:r>
+      <w:r>
+        <w:rPr>
+          <w:b/>
+          <w:bCs/>
+        </w:rPr>
+        <w:t xml:space="preserve">. </w:t>
+      </w:r>
+      <w:r>
+        <w:rPr>
+          <w:b/>
+          <w:bCs/>
+        </w:rPr>
+        <w:t>KIES EEN CATEGORIE</w:t>
+      </w:r>
+      <w:bookmarkEnd w:id="7"/>
+    </w:p>
+    <w:p>
+      <w:r>
+        <w:t>Na het gooien kiest de speler een categorie op de scorekaart. De applicatie berekent hoeveel punten de combinatie oplevert en vult de gekozen categorie in.</w:t>
+      </w:r>
+    </w:p>
+    <w:p>
+      <w:pPr>
+        <w:rPr>
+          <w:lang w:val="en-US"/>
+        </w:rPr>
+      </w:pPr>
+      <w:r>
+        <w:rPr>
+          <w:lang w:val="en-US"/>
+        </w:rPr>
+        <w:t>Alle mogelijke</w:t>
+      </w:r>
+      <w:r>
+        <w:rPr>
+          <w:lang w:val="en-US"/>
+        </w:rPr>
+        <w:t xml:space="preserve"> categorieën zijn Aces, Twos,</w:t>
+      </w:r>
+      <w:r>
+        <w:rPr>
+          <w:lang w:val="en-US"/>
+        </w:rPr>
+        <w:t xml:space="preserve"> Threes, Fours, Fives, Sixes,</w:t>
+      </w:r>
+      <w:r>
+        <w:rPr>
+          <w:lang w:val="en-US"/>
+        </w:rPr>
+        <w:t xml:space="preserve"> Three of a Kind, Four of a Kind, Full House, Small Straight, Large Straight en Chance.</w:t>
+      </w:r>
+    </w:p>
+    <w:p>
+      <w:r>
+        <w:t>De beschikbare categorieën en de bijbehorende scores worden door de applicatie weergegeven. De speler kiest een categorie door de gevraagde naam in te voeren. Let hierbij op de spelling.</w:t>
+      </w:r>
+      <w:r>
+        <w:t xml:space="preserve"> Hoofdletters maken niet uit.</w:t>
+      </w:r>
+    </w:p>
+    <w:p>
+      <w:r>
+        <w:t xml:space="preserve">Na dat </w:t>
+      </w:r>
+      <w:proofErr w:type="spellStart"/>
+      <w:r>
+        <w:t>catkiezen</w:t>
+      </w:r>
+      <w:proofErr w:type="spellEnd"/>
+      <w:r>
+        <w:t xml:space="preserve"> is </w:t>
+      </w:r>
+      <w:proofErr w:type="spellStart"/>
+      <w:r>
+        <w:t>geselecteert</w:t>
+      </w:r>
+      <w:proofErr w:type="spellEnd"/>
+      <w:r>
+        <w:t xml:space="preserve"> of de derde worp is af</w:t>
+      </w:r>
+      <w:r>
+        <w:t>gelopen:</w:t>
+      </w:r>
+      <w:r>
+        <w:br/>
+      </w:r>
+      <w:r>
+        <w:drawing>
+          <wp:inline distT="0" distB="0" distL="0" distR="0" wp14:anchorId="13AC4091" wp14:editId="46612B95">
+            <wp:extent cx="5760720" cy="4152900"/>
+            <wp:effectExtent l="0" t="0" r="0" b="0"/>
+            <wp:docPr id="169624156" name="Afbeelding 1"/>
+            <wp:cNvGraphicFramePr>
+              <a:graphicFrameLocks xmlns:a="http://schemas.openxmlformats.org/drawingml/2006/main" noChangeAspect="1"/>
+            </wp:cNvGraphicFramePr>
+            <a:graphic xmlns:a="http://schemas.openxmlformats.org/drawingml/2006/main">
+              <a:graphicData uri="http://schemas.openxmlformats.org/drawingml/2006/picture">
+                <pic:pic xmlns:pic="http://schemas.openxmlformats.org/drawingml/2006/picture">
+                  <pic:nvPicPr>
+                    <pic:cNvPr id="169624156" name=""/>
+                    <pic:cNvPicPr/>
+                  </pic:nvPicPr>
+                  <pic:blipFill>
+                    <a:blip r:embed="rId10"/>
+                    <a:stretch>
+                      <a:fillRect/>
+                    </a:stretch>
+                  </pic:blipFill>
+                  <pic:spPr>
+                    <a:xfrm>
+                      <a:off x="0" y="0"/>
+                      <a:ext cx="5760720" cy="4152900"/>
+                    </a:xfrm>
+                    <a:prstGeom prst="rect">
+                      <a:avLst/>
+                    </a:prstGeom>
+                  </pic:spPr>
+                </pic:pic>
+              </a:graphicData>
+            </a:graphic>
+          </wp:inline>
+        </w:drawing>
+      </w:r>
+    </w:p>
+    <w:p>
+      <w:bookmarkStart w:id="8" w:name="_Toc242436769"/>
+    </w:p>
+    <w:p/>
+    <w:p/>
+    <w:p/>
+    <w:p/>
     <w:p>
       <w:pPr>
         <w:pStyle w:val="Kop2"/>
@@ -1322,13 +1702,13 @@
           <w:bCs/>
         </w:rPr>
       </w:pPr>
-      <w:bookmarkStart w:id="7" w:name="_Toc242436768"/>
-      <w:r>
-        <w:rPr>
-          <w:b/>
-          <w:bCs/>
-        </w:rPr>
-        <w:t>6</w:t>
+      <w:r>
+        <w:rPr>
+          <w:b/>
+          <w:bCs/>
+        </w:rPr>
+        <w:lastRenderedPageBreak/>
+        <w:t>7</w:t>
       </w:r>
       <w:r>
         <w:rPr>
@@ -1342,86 +1722,24 @@
           <w:b/>
           <w:bCs/>
         </w:rPr>
-        <w:t>KIES EEN CATEGORIE</w:t>
-      </w:r>
-      <w:bookmarkEnd w:id="7"/>
-    </w:p>
-    <w:p>
-      <w:r>
-        <w:t>Na het gooien kiest de speler een categorie op de scorekaart. De applicatie berekent hoeveel punten de combinatie oplevert en vult de gekozen categorie in.</w:t>
-      </w:r>
-    </w:p>
-    <w:p>
-      <w:pPr>
-        <w:rPr>
-          <w:lang w:val="en-US"/>
-        </w:rPr>
-      </w:pPr>
-      <w:proofErr w:type="spellStart"/>
-      <w:r>
-        <w:rPr>
-          <w:lang w:val="en-US"/>
-        </w:rPr>
-        <w:t>Voorbeelden</w:t>
-      </w:r>
-      <w:proofErr w:type="spellEnd"/>
-      <w:r>
-        <w:rPr>
-          <w:lang w:val="en-US"/>
-        </w:rPr>
-        <w:t xml:space="preserve"> van </w:t>
-      </w:r>
-      <w:proofErr w:type="spellStart"/>
-      <w:r>
-        <w:rPr>
-          <w:lang w:val="en-US"/>
-        </w:rPr>
-        <w:t>categorieën</w:t>
-      </w:r>
-      <w:proofErr w:type="spellEnd"/>
-      <w:r>
-        <w:rPr>
-          <w:lang w:val="en-US"/>
-        </w:rPr>
-        <w:t xml:space="preserve"> </w:t>
-      </w:r>
-      <w:proofErr w:type="spellStart"/>
-      <w:r>
-        <w:rPr>
-          <w:lang w:val="en-US"/>
-        </w:rPr>
-        <w:t>zijn</w:t>
-      </w:r>
-      <w:proofErr w:type="spellEnd"/>
-      <w:r>
-        <w:rPr>
-          <w:lang w:val="en-US"/>
-        </w:rPr>
-        <w:t xml:space="preserve"> Aces, Twos, Three of a Kind, Four of a Kind, Full House, Small Straight, Large Straight </w:t>
-      </w:r>
-      <w:proofErr w:type="spellStart"/>
-      <w:r>
-        <w:rPr>
-          <w:lang w:val="en-US"/>
-        </w:rPr>
-        <w:t>en</w:t>
-      </w:r>
-      <w:proofErr w:type="spellEnd"/>
-      <w:r>
-        <w:rPr>
-          <w:lang w:val="en-US"/>
-        </w:rPr>
-        <w:t xml:space="preserve"> Chance.</w:t>
-      </w:r>
-    </w:p>
-    <w:p>
-      <w:r>
-        <w:t>De beschikbare categorieën en de bijbehorende scores worden door de applicatie weergegeven. De speler kiest een categorie door de gevraagde naam in te voeren. Let hierbij op de spelling.</w:t>
-      </w:r>
-    </w:p>
-    <w:p>
-      <w:r>
-        <w:t>[Screenshot (6)]</w:t>
+        <w:t>CATEGORIE MET NUL INVULLEN</w:t>
+      </w:r>
+      <w:bookmarkEnd w:id="8"/>
+    </w:p>
+    <w:p>
+      <w:r>
+        <w:t>Wanneer de speler geen geschikte combinatie heeft, kan deze ervoor kiezen om de optie SKIP te gebruiken. Daarna kiest de speler een categorie die nog niet is ingevuld.</w:t>
+      </w:r>
+    </w:p>
+    <w:p>
+      <w:r>
+        <w:t>De gekozen categorie krijgt dan nul punten. De categorie is hiermee gebruikt</w:t>
+      </w:r>
+      <w:r>
+        <w:t xml:space="preserve"> (of geschrapt)</w:t>
+      </w:r>
+      <w:r>
+        <w:t xml:space="preserve"> en kan tijdens dezelfde wedstrijd niet opnieuw worden ingevuld.</w:t>
       </w:r>
     </w:p>
     <w:p>
@@ -1432,13 +1750,78 @@
           <w:bCs/>
         </w:rPr>
       </w:pPr>
-      <w:bookmarkStart w:id="8" w:name="_Toc242436769"/>
-      <w:r>
-        <w:rPr>
-          <w:b/>
-          <w:bCs/>
-        </w:rPr>
-        <w:t>7</w:t>
+      <w:bookmarkStart w:id="9" w:name="_Toc242436770"/>
+      <w:r>
+        <w:rPr>
+          <w:rFonts w:asciiTheme="minorHAnsi" w:eastAsiaTheme="minorHAnsi" w:hAnsiTheme="minorHAnsi" w:cstheme="minorBidi"/>
+          <w:color w:val="auto"/>
+          <w:sz w:val="24"/>
+          <w:szCs w:val="24"/>
+        </w:rPr>
+        <w:drawing>
+          <wp:inline distT="0" distB="0" distL="0" distR="0" wp14:anchorId="03300BA4" wp14:editId="1B108501">
+            <wp:extent cx="5760720" cy="4164965"/>
+            <wp:effectExtent l="0" t="0" r="0" b="6985"/>
+            <wp:docPr id="1959783370" name="Afbeelding 1"/>
+            <wp:cNvGraphicFramePr>
+              <a:graphicFrameLocks xmlns:a="http://schemas.openxmlformats.org/drawingml/2006/main" noChangeAspect="1"/>
+            </wp:cNvGraphicFramePr>
+            <a:graphic xmlns:a="http://schemas.openxmlformats.org/drawingml/2006/main">
+              <a:graphicData uri="http://schemas.openxmlformats.org/drawingml/2006/picture">
+                <pic:pic xmlns:pic="http://schemas.openxmlformats.org/drawingml/2006/picture">
+                  <pic:nvPicPr>
+                    <pic:cNvPr id="1959783370" name=""/>
+                    <pic:cNvPicPr/>
+                  </pic:nvPicPr>
+                  <pic:blipFill>
+                    <a:blip r:embed="rId11"/>
+                    <a:stretch>
+                      <a:fillRect/>
+                    </a:stretch>
+                  </pic:blipFill>
+                  <pic:spPr>
+                    <a:xfrm>
+                      <a:off x="0" y="0"/>
+                      <a:ext cx="5760720" cy="4164965"/>
+                    </a:xfrm>
+                    <a:prstGeom prst="rect">
+                      <a:avLst/>
+                    </a:prstGeom>
+                  </pic:spPr>
+                </pic:pic>
+              </a:graphicData>
+            </a:graphic>
+          </wp:inline>
+        </w:drawing>
+      </w:r>
+    </w:p>
+    <w:p>
+      <w:r>
+        <w:t>Hoofdletter gebruik is hier wel gevoelig voor categorie kiezen.</w:t>
+      </w:r>
+    </w:p>
+    <w:p/>
+    <w:p/>
+    <w:p/>
+    <w:p/>
+    <w:p/>
+    <w:p/>
+    <w:p/>
+    <w:p>
+      <w:pPr>
+        <w:pStyle w:val="Kop2"/>
+        <w:rPr>
+          <w:b/>
+          <w:bCs/>
+        </w:rPr>
+      </w:pPr>
+      <w:r>
+        <w:rPr>
+          <w:b/>
+          <w:bCs/>
+        </w:rPr>
+        <w:lastRenderedPageBreak/>
+        <w:t>8</w:t>
       </w:r>
       <w:r>
         <w:rPr>
@@ -1452,39 +1835,135 @@
           <w:b/>
           <w:bCs/>
         </w:rPr>
-        <w:t>CATEGORIE MET NUL INVULLEN</w:t>
-      </w:r>
-      <w:bookmarkEnd w:id="8"/>
-    </w:p>
-    <w:p>
-      <w:r>
-        <w:t>Wanneer de speler geen geschikte combinatie heeft, kan deze ervoor kiezen om de optie SKIP te gebruiken. Daarna kiest de speler een categorie die nog niet is ingevuld.</w:t>
-      </w:r>
-    </w:p>
-    <w:p>
-      <w:r>
-        <w:t xml:space="preserve">De gekozen categorie krijgt dan </w:t>
+        <w:t>SCOREKAART INVULLEN</w:t>
+      </w:r>
+      <w:bookmarkEnd w:id="9"/>
+    </w:p>
+    <w:p>
+      <w:r>
+        <w:t>Tijdens het spel worden de ingevulde categorieën bijgehouden op de scorekaart. Een categorie die al is ingevuld, kan niet opnieuw worden gebruikt.</w:t>
+      </w:r>
+    </w:p>
+    <w:p>
+      <w:r>
+        <w:t>De speler gaat door met nieuwe beurten totdat alle categorieën zijn ingevuld. Bij twee spelers wordt bijgehouden welke speler aan de beurt is. De spelers spelen om de beurt totdat hun scorekaarten compleet zijn.</w:t>
+      </w:r>
+    </w:p>
+    <w:p>
+      <w:pPr>
+        <w:pStyle w:val="Kop2"/>
+        <w:rPr>
+          <w:b/>
+          <w:bCs/>
+        </w:rPr>
+      </w:pPr>
+      <w:bookmarkStart w:id="10" w:name="_Toc242436771"/>
+      <w:r>
+        <w:rPr>
+          <w:rFonts w:asciiTheme="minorHAnsi" w:eastAsiaTheme="minorHAnsi" w:hAnsiTheme="minorHAnsi" w:cstheme="minorBidi"/>
+          <w:color w:val="auto"/>
+          <w:sz w:val="24"/>
+          <w:szCs w:val="24"/>
+        </w:rPr>
+        <w:drawing>
+          <wp:inline distT="0" distB="0" distL="0" distR="0" wp14:anchorId="6307B7D9" wp14:editId="22D3D7E4">
+            <wp:extent cx="5760720" cy="1725930"/>
+            <wp:effectExtent l="0" t="0" r="0" b="7620"/>
+            <wp:docPr id="1540439778" name="Afbeelding 1"/>
+            <wp:cNvGraphicFramePr>
+              <a:graphicFrameLocks xmlns:a="http://schemas.openxmlformats.org/drawingml/2006/main" noChangeAspect="1"/>
+            </wp:cNvGraphicFramePr>
+            <a:graphic xmlns:a="http://schemas.openxmlformats.org/drawingml/2006/main">
+              <a:graphicData uri="http://schemas.openxmlformats.org/drawingml/2006/picture">
+                <pic:pic xmlns:pic="http://schemas.openxmlformats.org/drawingml/2006/picture">
+                  <pic:nvPicPr>
+                    <pic:cNvPr id="1540439778" name=""/>
+                    <pic:cNvPicPr/>
+                  </pic:nvPicPr>
+                  <pic:blipFill>
+                    <a:blip r:embed="rId12"/>
+                    <a:stretch>
+                      <a:fillRect/>
+                    </a:stretch>
+                  </pic:blipFill>
+                  <pic:spPr>
+                    <a:xfrm>
+                      <a:off x="0" y="0"/>
+                      <a:ext cx="5760720" cy="1725930"/>
+                    </a:xfrm>
+                    <a:prstGeom prst="rect">
+                      <a:avLst/>
+                    </a:prstGeom>
+                  </pic:spPr>
+                </pic:pic>
+              </a:graphicData>
+            </a:graphic>
+          </wp:inline>
+        </w:drawing>
+      </w:r>
+      <w:r>
+        <w:rPr>
+          <w:b/>
+          <w:bCs/>
+        </w:rPr>
+        <w:t>9</w:t>
+      </w:r>
+      <w:r>
+        <w:rPr>
+          <w:b/>
+          <w:bCs/>
+        </w:rPr>
+        <w:t xml:space="preserve">. </w:t>
+      </w:r>
+      <w:r>
+        <w:rPr>
+          <w:b/>
+          <w:bCs/>
+        </w:rPr>
+        <w:t>EINDE WEDSTRIJD</w:t>
+      </w:r>
+      <w:bookmarkEnd w:id="10"/>
+    </w:p>
+    <w:p>
+      <w:r>
+        <w:t>Wanneer alle categorieën zijn ingevuld, berekent de applicatie de totaalscore. Hierbij wordt ook gecontroleerd of de speler de bonus voor de bovenste categorieën heeft behaald.</w:t>
+      </w:r>
+    </w:p>
+    <w:p>
+      <w:r>
+        <w:t>Bij twee spelers worden de totaalscores met elkaar vergeleken. De speler met de hoogste score wint de wedstrijd. Wanneer beide spelers dezelfde score hebben, eindigt de wedstrijd in een gelijkspel.</w:t>
+      </w:r>
+    </w:p>
+    <w:p>
+      <w:r>
+        <w:t>Bij één speler wordt de behaalde totaalscore weergegeven.</w:t>
+      </w:r>
+    </w:p>
+    <w:p>
+      <w:r>
+        <w:t xml:space="preserve">Bij 5 wedstrijden wordt weer </w:t>
       </w:r>
       <w:proofErr w:type="gramStart"/>
       <w:r>
-        <w:t>nul punten</w:t>
+        <w:t>terug gegaan</w:t>
       </w:r>
       <w:proofErr w:type="gramEnd"/>
       <w:r>
-        <w:t>. De categorie is hiermee gebruikt</w:t>
-      </w:r>
-      <w:r>
-        <w:t xml:space="preserve"> (of geschrapt)</w:t>
-      </w:r>
-      <w:r>
-        <w:t xml:space="preserve"> en kan tijdens dezelfde wedstrijd niet opnieuw worden ingevuld.</w:t>
-      </w:r>
-    </w:p>
-    <w:p>
-      <w:r>
-        <w:t>[Screenshot (7)]</w:t>
-      </w:r>
-    </w:p>
+        <w:t xml:space="preserve"> naar stap 1 tot er 5 zijn gespeeld.</w:t>
+      </w:r>
+    </w:p>
+    <w:p>
+      <w:r>
+        <w:t>Bekijk screenshot hierboven.</w:t>
+      </w:r>
+    </w:p>
+    <w:p/>
+    <w:p/>
+    <w:p/>
+    <w:p/>
+    <w:p/>
+    <w:p/>
+    <w:p/>
     <w:p>
       <w:pPr>
         <w:pStyle w:val="Kop2"/>
@@ -1493,13 +1972,21 @@
           <w:bCs/>
         </w:rPr>
       </w:pPr>
-      <w:bookmarkStart w:id="9" w:name="_Toc242436770"/>
-      <w:r>
-        <w:rPr>
-          <w:b/>
-          <w:bCs/>
-        </w:rPr>
-        <w:t>8</w:t>
+      <w:bookmarkStart w:id="11" w:name="_Toc242436772"/>
+      <w:r>
+        <w:rPr>
+          <w:b/>
+          <w:bCs/>
+        </w:rPr>
+        <w:lastRenderedPageBreak/>
+        <w:t>1</w:t>
+      </w:r>
+      <w:r>
+        <w:rPr>
+          <w:b/>
+          <w:bCs/>
+        </w:rPr>
+        <w:t>0</w:t>
       </w:r>
       <w:r>
         <w:rPr>
@@ -1513,23 +2000,23 @@
           <w:b/>
           <w:bCs/>
         </w:rPr>
-        <w:t>SCOREKAART INVULLEN</w:t>
-      </w:r>
-      <w:bookmarkEnd w:id="9"/>
-    </w:p>
-    <w:p>
-      <w:r>
-        <w:t>Tijdens het spel worden de ingevulde categorieën bijgehouden op de scorekaart. Een categorie die al is ingevuld, kan niet opnieuw worden gebruikt.</w:t>
-      </w:r>
-    </w:p>
-    <w:p>
-      <w:r>
-        <w:t>De speler gaat door met nieuwe beurten totdat alle categorieën zijn ingevuld. Bij twee spelers wordt bijgehouden welke speler aan de beurt is. De spelers spelen om de beurt totdat hun scorekaarten compleet zijn.</w:t>
-      </w:r>
-    </w:p>
-    <w:p>
-      <w:r>
-        <w:t>[Screenshot (8)]</w:t>
+        <w:t>EINDRESULTAAT</w:t>
+      </w:r>
+      <w:bookmarkEnd w:id="11"/>
+    </w:p>
+    <w:p>
+      <w:r>
+        <w:t>Wanneer er één wedstrijd is gespeeld, wordt de eindscore van die wedstrijd weergegeven.</w:t>
+      </w:r>
+    </w:p>
+    <w:p>
+      <w:r>
+        <w:t>Wanneer er vijf wedstrijden zijn gespeeld, telt de applicatie de scores van alle wedstrijden per speler bij elkaar op. Daarna worden de eindtotalen vergeleken om de uiteindelijke winnaar te bepalen.</w:t>
+      </w:r>
+    </w:p>
+    <w:p>
+      <w:r>
+        <w:t>Bij één speler wordt de opgetelde score van de gespeelde wedstrijden weergegeven.</w:t>
       </w:r>
     </w:p>
     <w:p>
@@ -1540,133 +2027,50 @@
           <w:bCs/>
         </w:rPr>
       </w:pPr>
-      <w:bookmarkStart w:id="10" w:name="_Toc242436771"/>
-      <w:r>
-        <w:rPr>
-          <w:b/>
-          <w:bCs/>
-        </w:rPr>
-        <w:t>9</w:t>
-      </w:r>
-      <w:r>
-        <w:rPr>
-          <w:b/>
-          <w:bCs/>
-        </w:rPr>
-        <w:t xml:space="preserve">. </w:t>
-      </w:r>
-      <w:r>
-        <w:rPr>
-          <w:b/>
-          <w:bCs/>
-        </w:rPr>
-        <w:t>EINDE WEDSTRIJD</w:t>
-      </w:r>
-      <w:bookmarkEnd w:id="10"/>
-    </w:p>
-    <w:p>
-      <w:r>
-        <w:t>Wanneer alle categorieën zijn ingevuld, berekent de applicatie de totaalscore. Hierbij wordt ook gecontroleerd of de speler de bonus voor de bovenste categorieën heeft behaald.</w:t>
-      </w:r>
-    </w:p>
-    <w:p>
-      <w:r>
-        <w:t>Bij twee spelers worden de totaalscores met elkaar vergeleken. De speler met de hoogste score wint de wedstrijd. Wanneer beide spelers dezelfde score hebben, eindigt de wedstrijd in een gelijkspel.</w:t>
-      </w:r>
-    </w:p>
-    <w:p>
-      <w:r>
-        <w:t>Bij één speler wordt de behaalde totaalscore weergegeven.</w:t>
-      </w:r>
-    </w:p>
-    <w:p>
-      <w:r>
-        <w:t xml:space="preserve">Bij 5 wedstrijden wordt weer </w:t>
-      </w:r>
-      <w:proofErr w:type="gramStart"/>
-      <w:r>
-        <w:t>terug gegaan</w:t>
-      </w:r>
-      <w:proofErr w:type="gramEnd"/>
-      <w:r>
-        <w:t xml:space="preserve"> naar stap 1 tot er 5 zijn gespeeld.</w:t>
-      </w:r>
-    </w:p>
-    <w:p>
-      <w:r>
-        <w:lastRenderedPageBreak/>
-        <w:t>[Screenshot (9)]</w:t>
-      </w:r>
-    </w:p>
-    <w:p/>
-    <w:p>
-      <w:pPr>
-        <w:pStyle w:val="Kop2"/>
-        <w:rPr>
-          <w:b/>
-          <w:bCs/>
-        </w:rPr>
-      </w:pPr>
-      <w:bookmarkStart w:id="11" w:name="_Toc242436772"/>
-      <w:r>
-        <w:rPr>
-          <w:b/>
-          <w:bCs/>
-        </w:rPr>
-        <w:t>1</w:t>
-      </w:r>
-      <w:r>
-        <w:rPr>
-          <w:b/>
-          <w:bCs/>
-        </w:rPr>
-        <w:t>0</w:t>
-      </w:r>
-      <w:r>
-        <w:rPr>
-          <w:b/>
-          <w:bCs/>
-        </w:rPr>
-        <w:t xml:space="preserve">. </w:t>
-      </w:r>
-      <w:r>
-        <w:rPr>
-          <w:b/>
-          <w:bCs/>
-        </w:rPr>
-        <w:t>EINDRESULTAAT</w:t>
-      </w:r>
-      <w:bookmarkEnd w:id="11"/>
-    </w:p>
-    <w:p>
-      <w:r>
-        <w:t>Wanneer er één wedstrijd is gespeeld, wordt de eindscore van die wedstrijd weergegeven.</w:t>
-      </w:r>
-    </w:p>
-    <w:p>
-      <w:r>
-        <w:t>Wanneer er vijf wedstrijden zijn gespeeld, telt de applicatie de scores van alle wedstrijden per speler bij elkaar op. Daarna worden de eindtotalen vergeleken om de uiteindelijke winnaar te bepalen.</w:t>
-      </w:r>
-    </w:p>
-    <w:p>
-      <w:r>
-        <w:t>Bij één speler wordt de opgetelde score van de gespeelde wedstrijden weergegeven.</w:t>
-      </w:r>
-    </w:p>
-    <w:p>
-      <w:r>
-        <w:t>[Screenshot (10)]</w:t>
-      </w:r>
-    </w:p>
-    <w:p>
-      <w:pPr>
-        <w:pStyle w:val="Kop2"/>
-        <w:rPr>
-          <w:b/>
-          <w:bCs/>
-        </w:rPr>
-      </w:pPr>
       <w:bookmarkStart w:id="12" w:name="_Toc242436773"/>
+      <w:r>
+        <w:rPr>
+          <w:rFonts w:asciiTheme="minorHAnsi" w:eastAsiaTheme="minorHAnsi" w:hAnsiTheme="minorHAnsi" w:cstheme="minorBidi"/>
+          <w:color w:val="auto"/>
+          <w:sz w:val="24"/>
+          <w:szCs w:val="24"/>
+        </w:rPr>
+        <w:drawing>
+          <wp:inline distT="0" distB="0" distL="0" distR="0" wp14:anchorId="063A865F" wp14:editId="451DB04A">
+            <wp:extent cx="5760720" cy="1682115"/>
+            <wp:effectExtent l="0" t="0" r="0" b="0"/>
+            <wp:docPr id="1712366193" name="Afbeelding 1"/>
+            <wp:cNvGraphicFramePr>
+              <a:graphicFrameLocks xmlns:a="http://schemas.openxmlformats.org/drawingml/2006/main" noChangeAspect="1"/>
+            </wp:cNvGraphicFramePr>
+            <a:graphic xmlns:a="http://schemas.openxmlformats.org/drawingml/2006/main">
+              <a:graphicData uri="http://schemas.openxmlformats.org/drawingml/2006/picture">
+                <pic:pic xmlns:pic="http://schemas.openxmlformats.org/drawingml/2006/picture">
+                  <pic:nvPicPr>
+                    <pic:cNvPr id="1712366193" name=""/>
+                    <pic:cNvPicPr/>
+                  </pic:nvPicPr>
+                  <pic:blipFill>
+                    <a:blip r:embed="rId13"/>
+                    <a:stretch>
+                      <a:fillRect/>
+                    </a:stretch>
+                  </pic:blipFill>
+                  <pic:spPr>
+                    <a:xfrm>
+                      <a:off x="0" y="0"/>
+                      <a:ext cx="5760720" cy="1682115"/>
+                    </a:xfrm>
+                    <a:prstGeom prst="rect">
+                      <a:avLst/>
+                    </a:prstGeom>
+                  </pic:spPr>
+                </pic:pic>
+              </a:graphicData>
+            </a:graphic>
+          </wp:inline>
+        </w:drawing>
+      </w:r>
       <w:r>
         <w:rPr>
           <w:b/>

</xml_diff>